<commit_message>
Add LOI meeting materials for Adlay deal and align LOI schedule
- LOI checklist (xlsx) modeled on the Karakami format, populated with
  Adlay/ZETA deal facts, split-scheme details and open diligence points
- Assumed schedule (xlsx) covering 2026/7/27-10/16, with weekday, holiday
  and rokuyo columns; rokuyo algorithm validated against the reference file
- Update the LOI draft schedule table to match the new schedule

Co-Authored-By: Claude Opus 4.8 <noreply@anthropic.com>
Claude-Session: https://claude.ai/code/session_01QAubPxHrvJJp3Me5PWdmUc
</commit_message>
<xml_diff>
--- a/意向表明書_株式会社アドレイ_ZETA株式会社_ドラフト.docx
+++ b/意向表明書_株式会社アドレイ_ZETA株式会社_ドラフト.docx
@@ -1065,7 +1065,7 @@
                 <w:b/>
                 <w:sz w:val="20"/>
               </w:rPr>
-              <w:t>2026年7月下旬～8月上旬</w:t>
+              <w:t>2026年7月31日～8月7日</w:t>
             </w:r>
           </w:p>
         </w:tc>
@@ -1107,7 +1107,49 @@
                 <w:b/>
                 <w:sz w:val="20"/>
               </w:rPr>
-              <w:t>2026年8月上旬～中旬</w:t>
+              <w:t>2026年8月14日</w:t>
+            </w:r>
+          </w:p>
+        </w:tc>
+        <w:tc>
+          <w:tcPr>
+            <w:tcW w:type="dxa" w:w="6350"/>
+          </w:tcPr>
+          <w:p>
+            <w:pPr>
+              <w:spacing w:after="20" w:before="20"/>
+            </w:pPr>
+            <w:r/>
+            <w:r>
+              <w:rPr>
+                <w:rFonts w:ascii="游明朝" w:hAnsi="游明朝" w:eastAsia="游明朝"/>
+                <w:b w:val="0"/>
+                <w:sz w:val="20"/>
+              </w:rPr>
+              <w:t>本意向表明書のご確認・ご応諾（独占交渉権の発生）</w:t>
+            </w:r>
+          </w:p>
+        </w:tc>
+      </w:tr>
+      <w:tr>
+        <w:tc>
+          <w:tcPr>
+            <w:tcW w:type="dxa" w:w="2948"/>
+            <w:shd w:val="clear" w:color="auto" w:fill="F2F2F2"/>
+          </w:tcPr>
+          <w:p>
+            <w:pPr>
+              <w:spacing w:after="20" w:before="20"/>
+              <w:jc w:val="center"/>
+            </w:pPr>
+            <w:r/>
+            <w:r>
+              <w:rPr>
+                <w:rFonts w:ascii="游明朝" w:hAnsi="游明朝" w:eastAsia="游明朝"/>
+                <w:b/>
+                <w:sz w:val="20"/>
+              </w:rPr>
+              <w:t>2026年8月17日～9月4日</w:t>
             </w:r>
           </w:p>
         </w:tc>
@@ -1149,7 +1191,7 @@
                 <w:b/>
                 <w:sz w:val="20"/>
               </w:rPr>
-              <w:t>2026年8月下旬～9月上旬</w:t>
+              <w:t>2026年8月17日～9月30日</w:t>
             </w:r>
           </w:p>
         </w:tc>
@@ -1169,6 +1211,19 @@
                 <w:sz w:val="20"/>
               </w:rPr>
               <w:t>会社分割（新設分割）に係る準備・手続</w:t>
+            </w:r>
+          </w:p>
+          <w:p>
+            <w:pPr>
+              <w:spacing w:after="20" w:before="20"/>
+            </w:pPr>
+            <w:r>
+              <w:rPr>
+                <w:rFonts w:ascii="游明朝" w:hAnsi="游明朝" w:eastAsia="游明朝"/>
+                <w:b w:val="0"/>
+                <w:sz w:val="20"/>
+              </w:rPr>
+              <w:t>（分割計画書の作成、労働者への通知・協議、株主総会決議、債権者保護手続等）</w:t>
             </w:r>
           </w:p>
         </w:tc>
@@ -1191,7 +1246,7 @@
                 <w:b/>
                 <w:sz w:val="20"/>
               </w:rPr>
-              <w:t>2026年9月上旬～中旬</w:t>
+              <w:t>2026年10月1日</w:t>
             </w:r>
           </w:p>
         </w:tc>
@@ -1210,7 +1265,7 @@
                 <w:b w:val="0"/>
                 <w:sz w:val="20"/>
               </w:rPr>
-              <w:t>株式譲渡契約書等の締結</w:t>
+              <w:t>分割期日（新設会社の設立登記）</w:t>
             </w:r>
           </w:p>
         </w:tc>
@@ -1233,7 +1288,7 @@
                 <w:b/>
                 <w:sz w:val="20"/>
               </w:rPr>
-              <w:t>2026年9月下旬～10月上旬</w:t>
+              <w:t>2026年10月2日</w:t>
             </w:r>
           </w:p>
         </w:tc>
@@ -1252,7 +1307,7 @@
                 <w:b w:val="0"/>
                 <w:sz w:val="20"/>
               </w:rPr>
-              <w:t>クロージング対応（分割期日・許認可・契約承継等）</w:t>
+              <w:t>株式譲渡契約書（SPA）の締結</w:t>
             </w:r>
           </w:p>
         </w:tc>
@@ -1275,7 +1330,49 @@
                 <w:b/>
                 <w:sz w:val="20"/>
               </w:rPr>
-              <w:t>2026年10月中旬</w:t>
+              <w:t>2026年10月5日～10月12日</w:t>
+            </w:r>
+          </w:p>
+        </w:tc>
+        <w:tc>
+          <w:tcPr>
+            <w:tcW w:type="dxa" w:w="6350"/>
+          </w:tcPr>
+          <w:p>
+            <w:pPr>
+              <w:spacing w:after="20" w:before="20"/>
+            </w:pPr>
+            <w:r/>
+            <w:r>
+              <w:rPr>
+                <w:rFonts w:ascii="游明朝" w:hAnsi="游明朝" w:eastAsia="游明朝"/>
+                <w:b w:val="0"/>
+                <w:sz w:val="20"/>
+              </w:rPr>
+              <w:t>クロージング準備（前提条件の充足確認等）</w:t>
+            </w:r>
+          </w:p>
+        </w:tc>
+      </w:tr>
+      <w:tr>
+        <w:tc>
+          <w:tcPr>
+            <w:tcW w:type="dxa" w:w="2948"/>
+            <w:shd w:val="clear" w:color="auto" w:fill="F2F2F2"/>
+          </w:tcPr>
+          <w:p>
+            <w:pPr>
+              <w:spacing w:after="20" w:before="20"/>
+              <w:jc w:val="center"/>
+            </w:pPr>
+            <w:r/>
+            <w:r>
+              <w:rPr>
+                <w:rFonts w:ascii="游明朝" w:hAnsi="游明朝" w:eastAsia="游明朝"/>
+                <w:b/>
+                <w:sz w:val="20"/>
+              </w:rPr>
+              <w:t>2026年10月13日</w:t>
             </w:r>
           </w:p>
         </w:tc>

</xml_diff>

<commit_message>
Rewrite section 1 of the LOI with a concrete acquisition rationale
Replace the placeholder-heavy company overview and purpose section with
substantive text: buyer profile grounded in ZETA's CX product suite, a
背景 section tying the target's Salesforce CDP/MA capability and creative
production to ZETA's retail media strategy, and a post-deal growth plan.

Co-Authored-By: Claude Opus 4.8 <noreply@anthropic.com>
Claude-Session: https://claude.ai/code/session_01QAubPxHrvJJp3Me5PWdmUc
</commit_message>
<xml_diff>
--- a/意向表明書_株式会社アドレイ_ZETA株式会社_ドラフト.docx
+++ b/意向表明書_株式会社アドレイ_ZETA株式会社_ドラフト.docx
@@ -221,7 +221,7 @@
                 <w:b w:val="0"/>
                 <w:sz w:val="19"/>
               </w:rPr>
-              <w:t>ZETA株式会社</w:t>
+              <w:t>ZETA株式会社（東京証券取引所グロース市場・証券コード6031）</w:t>
             </w:r>
           </w:p>
         </w:tc>
@@ -263,7 +263,7 @@
                 <w:b w:val="0"/>
                 <w:sz w:val="19"/>
               </w:rPr>
-              <w:t>●●●●●●●●●</w:t>
+              <w:t>東京都世田谷区三軒茶屋2-11-22 サンタワーズセンタービル17階</w:t>
             </w:r>
           </w:p>
         </w:tc>
@@ -389,7 +389,7 @@
                 <w:b w:val="0"/>
                 <w:sz w:val="19"/>
               </w:rPr>
-              <w:t>●● ●●</w:t>
+              <w:t>山﨑 徳之</w:t>
             </w:r>
           </w:p>
         </w:tc>
@@ -431,7 +431,7 @@
                 <w:b w:val="0"/>
                 <w:sz w:val="19"/>
               </w:rPr>
-              <w:t>●●●百万円（2025年●月期）</w:t>
+              <w:t>●●●百万円（2025年12月期）</w:t>
             </w:r>
           </w:p>
         </w:tc>
@@ -515,7 +515,7 @@
                 <w:b w:val="0"/>
                 <w:sz w:val="19"/>
               </w:rPr>
-              <w:t>・●●●●●●</w:t>
+              <w:t>・EC・小売事業者向けCX向上ソリューション「ZETA CXシリーズ」の開発・提供</w:t>
             </w:r>
           </w:p>
           <w:p>
@@ -528,7 +528,7 @@
                 <w:b w:val="0"/>
                 <w:sz w:val="19"/>
               </w:rPr>
-              <w:t>・●●●●●●</w:t>
+              <w:t xml:space="preserve">　（ZETA SEARCH／ZETA VOICE／ZETA AD／ZETA RECOMMEND／ZETA HASHTAG 等）</w:t>
             </w:r>
           </w:p>
           <w:p>
@@ -541,7 +541,20 @@
                 <w:b w:val="0"/>
                 <w:sz w:val="19"/>
               </w:rPr>
-              <w:t>・●●●●●●</w:t>
+              <w:t>・リテールメディア事業</w:t>
+            </w:r>
+          </w:p>
+          <w:p>
+            <w:pPr>
+              <w:spacing w:after="20" w:before="20"/>
+            </w:pPr>
+            <w:r>
+              <w:rPr>
+                <w:rFonts w:ascii="游明朝" w:hAnsi="游明朝" w:eastAsia="游明朝"/>
+                <w:b w:val="0"/>
+                <w:sz w:val="19"/>
+              </w:rPr>
+              <w:t>・生成AIを活用したデジタルマーケティング支援</w:t>
             </w:r>
           </w:p>
         </w:tc>
@@ -551,6 +564,20 @@
       <w:pPr>
         <w:spacing w:after="40" w:before="0"/>
       </w:pPr>
+    </w:p>
+    <w:p>
+      <w:pPr>
+        <w:spacing w:after="120" w:before="0" w:line="276" w:lineRule="auto"/>
+        <w:ind w:left="0" w:firstLine="198"/>
+      </w:pPr>
+      <w:r>
+        <w:rPr>
+          <w:rFonts w:ascii="游明朝" w:hAnsi="游明朝" w:eastAsia="游明朝"/>
+          <w:b w:val="0"/>
+          <w:sz w:val="21"/>
+        </w:rPr>
+        <w:t>弊社は、●●年の創業以来、EC・小売事業者様向けのソフトウェア開発を主たる事業として展開してまいりました。現在は、サイト内検索エンジン「ZETA SEARCH」、クチコミ・UGC活用エンジン「ZETA VOICE」、リテールメディア広告エンジン「ZETA AD」、レコメンドエンジン「ZETA RECOMMEND」等で構成される「ZETA CXシリーズ」を中核として、大手ECサイト、アパレル、旅行・レジャー、ネットスーパー等の幅広い業種のお客様に対し、購買体験（CX）の最適化を支援するソリューションを提供しております。近年は、生成AIの活用領域の拡大及びリテールメディア事業の強化に注力し、国内最大のコマースメディア企業となることを目指して、事業領域及び規模の拡大に取り組んでおります。</w:t>
+      </w:r>
     </w:p>
     <w:p>
       <w:pPr>
@@ -576,7 +603,49 @@
           <w:b w:val="0"/>
           <w:sz w:val="21"/>
         </w:rPr>
-        <w:t>このような中、株式会社M&amp;A承継機構様より、貴社が営むData＆Digital Growth事業（Salesforceの導入から運用までのコンサルティング事業）及び広告制作事業をご紹介いただきました。貴社は、株式会社セールスフォース・ジャパン認定パートナーとして、Marketing Cloud及びData Cloudの導入・運用支援において豊富な実績を有され、また広告制作事業においては朝日新聞社との50年以上にわたる取引実績を背景に、安定した事業基盤を築いておられます。弊社は、これら2事業が有するデジタルマーケティング領域の専門性、優良な顧客基盤、及び高い専門性を有する人材・組織体制を高く評価しており、本件に強い関心を抱いた次第です。</w:t>
+        <w:t>弊社が展開する「ZETA CXシリーズ」は、EC・小売事業者様のサイト内における購買体験の最適化を担うプロダクトであり、導入企業様からは、検索・レコメンド・クチコミ等を通じて蓄積される行動データを、CRM及びMA（マーケティングオートメーション）領域と連携させ、サイト外を含む一貫した顧客コミュニケーションを実現したいとのご要望を数多く頂戴しております。他方、弊社はこれまでプロダクトの提供を主軸としてまいりましたことから、Salesforce Marketing Cloud及びData Cloudをはじめとする顧客データ基盤の導入・運用を、コンサルティングから実装・運用までワンストップでご支援する体制の獲得が、かねてより重要な経営課題であると認識しておりました。</w:t>
+      </w:r>
+    </w:p>
+    <w:p>
+      <w:pPr>
+        <w:spacing w:after="120" w:before="0" w:line="276" w:lineRule="auto"/>
+        <w:ind w:left="0" w:firstLine="198"/>
+      </w:pPr>
+      <w:r>
+        <w:rPr>
+          <w:rFonts w:ascii="游明朝" w:hAnsi="游明朝" w:eastAsia="游明朝"/>
+          <w:b w:val="0"/>
+          <w:sz w:val="21"/>
+        </w:rPr>
+        <w:t>そのような中、株式会社M&amp;A承継機構様より、貴社が営むData＆Digital Growth事業及び広告制作事業をご紹介いただき、両事業が有する専門人材、顧客基盤及び実績の概要を拝見し、本件に強い関心を抱いた次第です。</w:t>
+      </w:r>
+    </w:p>
+    <w:p>
+      <w:pPr>
+        <w:spacing w:after="120" w:before="0" w:line="276" w:lineRule="auto"/>
+        <w:ind w:left="0" w:firstLine="198"/>
+      </w:pPr>
+      <w:r>
+        <w:rPr>
+          <w:rFonts w:ascii="游明朝" w:hAnsi="游明朝" w:eastAsia="游明朝"/>
+          <w:b w:val="0"/>
+          <w:sz w:val="21"/>
+        </w:rPr>
+        <w:t>Data＆Digital Growth事業は、株式会社セールスフォース・ジャパン認定パートナーとして、Marketing Cloud及びData Cloudの導入から運用支援までを一貫して手掛けられ、Marketing Cloudコンサルタント、Data Cloudコンサルタント、Marketing Cloudデベロッパー等の認定資格を有する専門人材を擁しておられます。同事業が有する顧客データ基盤（CDP）の設計・実装力、及びシステムベンダーのコントロールを含むプロジェクト推進力は、弊社プロダクトが保有するEC行動データ・検索データ・クチコミデータとの連携により、リテールメディア広告のターゲティング精度の向上及びOne to Oneコミュニケーションの高度化に直結するものであり、弊社の事業戦略と極めて高い親和性を有していると認識しております。</w:t>
+      </w:r>
+    </w:p>
+    <w:p>
+      <w:pPr>
+        <w:spacing w:after="120" w:before="0" w:line="276" w:lineRule="auto"/>
+        <w:ind w:left="0" w:firstLine="198"/>
+      </w:pPr>
+      <w:r>
+        <w:rPr>
+          <w:rFonts w:ascii="游明朝" w:hAnsi="游明朝" w:eastAsia="游明朝"/>
+          <w:b w:val="0"/>
+          <w:sz w:val="21"/>
+        </w:rPr>
+        <w:t>また、広告制作事業につきましては、朝日新聞社様との50年以上にわたる取引実績を背景とした安定的な収益基盤を有されるとともに、企画・制作からデジタル領域までを担うクリエイティブ機能を内包しておられます。弊社が注力するリテールメディア領域におきましては、広告クリエイティブの企画・制作機能を内製で保有することが競争優位に直結するものと考えており、同事業は弊社にとって戦略的に重要な意義を有するものと評価しております。</w:t>
       </w:r>
     </w:p>
     <w:p>
@@ -603,7 +672,7 @@
           <w:b w:val="0"/>
           <w:sz w:val="21"/>
         </w:rPr>
-        <w:t>本件実行後は、貴社が長年にわたり培ってこられた事業の特長、顧客との信頼関係、及び従業員の皆様の知見・経験を最大限尊重しつつ、弊社の経営資源及びネットワークを掛け合わせることで、更なる受注拡大、サービス品質の維持・向上、及び事業の安定的な成長を図る方針です。また、従業員の皆様は本件事業の運営において最も重要な資産であると認識しており、雇用の維持及び処遇に十分配慮のうえ、事業の継続性を重視した運営を行う方針です。</w:t>
+        <w:t>本件実行後は、貴社2事業が長年にわたり培ってこられた顧客との信頼関係、案件遂行体制及び品質基準を尊重し、既存事業の安定的な継続を最優先といたします。そのうえで、弊社の上場企業としての信用力、EC・小売領域における顧客基盤及び営業ネットワークを活用し、①弊社既存顧客に対するSalesforce導入・運用支援サービスのクロスセル、②Data＆Digital Growth事業のお客様に対する「ZETA CXシリーズ」のご提案、③リテールメディア広告における企画・制作からデータ連携・効果測定までの一気通貫でのご提供体制の構築を通じて、両事業の受注拡大と収益性の向上を図る方針です。</w:t>
       </w:r>
     </w:p>
     <w:p>
@@ -617,7 +686,35 @@
           <w:b w:val="0"/>
           <w:sz w:val="21"/>
         </w:rPr>
-        <w:t>本件は、弊社にとって、●●事業との高いシナジーが見込まれる戦略的投資であり、弊社の中長期的な企業価値向上に資する重要な位置付けであると認識しております。弊社の希望条件等は下記のとおりでございますので、ご検討のほど、よろしくお願い申し上げます。</w:t>
+        <w:t>また、Salesforce関連の認定資格を有する専門人材は、採用市場において希少性が高く、貴社事業の中核をなす最も重要な資産であると認識しております。したがいまして、従業員の皆様につきましては、現在の雇用条件を維持したうえでの継続雇用を前提とし、加えて、弊社の事業機会を通じた成長機会のご提供及び処遇の向上にも努めてまいります。経営体制につきましては、加藤代表取締役に引き続き事業運営の中核をお務めいただくことを前提とし、弊社からは管理部門を中心とした支援を行うことで、現場の運営体制に過度な変更を生じさせない形での統合を想定しております。</w:t>
+      </w:r>
+    </w:p>
+    <w:p>
+      <w:pPr>
+        <w:spacing w:after="120" w:before="0" w:line="276" w:lineRule="auto"/>
+        <w:ind w:left="0" w:firstLine="198"/>
+      </w:pPr>
+      <w:r>
+        <w:rPr>
+          <w:rFonts w:ascii="游明朝" w:hAnsi="游明朝" w:eastAsia="游明朝"/>
+          <w:b w:val="0"/>
+          <w:sz w:val="21"/>
+        </w:rPr>
+        <w:t>本件は、弊社にとって、プロダクトの提供を主軸とする既存事業に、顧客データ基盤の導入・運用支援機能及びクリエイティブ制作機能を加え、EC・小売事業者様のCX向上をより広範かつ一貫してご支援する体制を構築するための戦略的投資であり、弊社の中長期的な企業価値向上に資する重要な位置付けであると認識しております。</w:t>
+      </w:r>
+    </w:p>
+    <w:p>
+      <w:pPr>
+        <w:spacing w:after="120" w:before="0" w:line="276" w:lineRule="auto"/>
+        <w:ind w:left="0" w:firstLine="198"/>
+      </w:pPr>
+      <w:r>
+        <w:rPr>
+          <w:rFonts w:ascii="游明朝" w:hAnsi="游明朝" w:eastAsia="游明朝"/>
+          <w:b w:val="0"/>
+          <w:sz w:val="21"/>
+        </w:rPr>
+        <w:t>弊社の希望条件等は下記のとおりでございますので、ご検討のほど、よろしくお願い申し上げます。</w:t>
       </w:r>
     </w:p>
     <w:p>

</xml_diff>

<commit_message>
Revise the transferred-assets clause to keep business assets in the target
Rewrite section 2(5) so all operating assets stay with the target company,
state explicitly what the new company receives (real estate, surplus cash,
short-term loan), and resolve the previously hedged treatment of equipment
classified under tangible fixed assets.

Co-Authored-By: Claude Opus 4.8 <noreply@anthropic.com>
Claude-Session: https://claude.ai/code/session_01QAubPxHrvJJp3Me5PWdmUc
</commit_message>
<xml_diff>
--- a/意向表明書_株式会社アドレイ_ZETA株式会社_ドラフト.docx
+++ b/意向表明書_株式会社アドレイ_ZETA株式会社_ドラフト.docx
@@ -946,7 +946,7 @@
           <w:b w:val="0"/>
           <w:sz w:val="21"/>
         </w:rPr>
-        <w:t>本件において対象会社に帰属したまま実質的に承継の対象となる資産等は、別紙1記載の器具備品・ソフトウェア・リース資産等（2025年7月末帳簿価額11,232千円）、及びSalesforce関連ライセンス（税抜6,618千円）を中心に、譲渡日現在において譲渡対象2事業の運営に必要な什器備品、ソフトウェア、各種システムに係る資産又は利用権、Webサイト、ドメイン、SNSアカウント、ロゴその他の知的財産又は使用権、各種マニュアル、顧客情報、営業上の資料及びノウハウその他譲渡対象2事業に属する資産一式を想定しております。</w:t>
+        <w:t>本件は株式譲渡の方法によるため、対象会社に帰属する資産は、個別の移転手続を要することなく、そのまま対象会社に残置されることを前提としております。具体的には、別紙1記載の器具備品・ソフトウェア・リース資産等（2025年7月末帳簿価額11,232千円）及びSalesforce関連ライセンス（税抜6,618千円）をはじめ、譲渡日現在において譲渡対象2事業の運営に必要な什器備品、ソフトウェア、各種システムに係る資産又は利用権、Webサイト、ドメイン、SNSアカウント、ロゴその他の知的財産又は使用権、各種マニュアル、顧客情報、営業上の資料及びノウハウその他譲渡対象2事業に属する資産一式は、いずれも対象会社に残置いただくことを想定しております。</w:t>
       </w:r>
     </w:p>
     <w:p>
@@ -960,7 +960,49 @@
           <w:b w:val="0"/>
           <w:sz w:val="21"/>
         </w:rPr>
-        <w:t>なお、ソフトウェア（ブランドチューニング）及び繰延資産（感情解析ソリューション初期費用）については権利関係を確認中と伺っており、また、有形固定資産のうち事業用資産（工具器具備品・機械装置等）の一部については、承継対象資産の確定に伴い調整が生じる可能性があるものと認識しております。承継対象資産等の詳細及び承継方法（新設分割による承継対象と対象会社残置の切り分けを含みます。）については、買収監査の結果を踏まえ、最終契約書締結までに双方協議のうえ確定するものといたします。</w:t>
+        <w:t>他方、新設分割により新設会社（貴社株主様側）へ承継いただく資産は、不動産賃貸事業に係る有形固定資産196,082千円（土地・建物等）、余剰現預金96,716千円及び短期貸付金63,600千円に限るものとし、対象会社には借入金55,049千円と同額の現預金55,049千円を残置することにより、対象会社のネットキャッシュを±0とすることを前提としております。</w:t>
+      </w:r>
+    </w:p>
+    <w:p>
+      <w:pPr>
+        <w:spacing w:after="120" w:before="0" w:line="276" w:lineRule="auto"/>
+        <w:ind w:left="0" w:firstLine="198"/>
+      </w:pPr>
+      <w:r>
+        <w:rPr>
+          <w:rFonts w:ascii="游明朝" w:hAnsi="游明朝" w:eastAsia="游明朝"/>
+          <w:b w:val="0"/>
+          <w:sz w:val="21"/>
+        </w:rPr>
+        <w:t>なお、2025年7月末時点において有形固定資産に区分されている資産のうち、工具器具備品671千円及び機械装置279千円等の事業用資産につきましては、譲渡対象2事業の運営に供されるものとして、新設会社への承継対象からは除外し、対象会社に残置いただくことを想定しております。また、賃貸不動産に係る長期預り保証金6,480千円につきましては、不動産賃貸事業に付随するものとして、同事業とともに新設会社へ承継いただくことを想定しております。</w:t>
+      </w:r>
+    </w:p>
+    <w:p>
+      <w:pPr>
+        <w:spacing w:after="120" w:before="0" w:line="276" w:lineRule="auto"/>
+        <w:ind w:left="0" w:firstLine="198"/>
+      </w:pPr>
+      <w:r>
+        <w:rPr>
+          <w:rFonts w:ascii="游明朝" w:hAnsi="游明朝" w:eastAsia="游明朝"/>
+          <w:b w:val="0"/>
+          <w:sz w:val="21"/>
+        </w:rPr>
+        <w:t>ソフトウェア（ブランドチューニング5,500千円）及び繰延資産（感情解析ソリューション初期費用2,050千円）につきましては、権利関係を確認中と伺っておりますが、いずれも対象会社に帰属するものとして整理いただくことを前提とし、買収監査においてその権利関係を確認させていただきたく存じます。</w:t>
+      </w:r>
+    </w:p>
+    <w:p>
+      <w:pPr>
+        <w:spacing w:after="120" w:before="0" w:line="276" w:lineRule="auto"/>
+        <w:ind w:left="0" w:firstLine="198"/>
+      </w:pPr>
+      <w:r>
+        <w:rPr>
+          <w:rFonts w:ascii="游明朝" w:hAnsi="游明朝" w:eastAsia="游明朝"/>
+          <w:b w:val="0"/>
+          <w:sz w:val="21"/>
+        </w:rPr>
+        <w:t>承継対象資産等の詳細及び新設分割による承継対象と対象会社残置の切り分けにつきましては、買収監査の結果を踏まえ、最終契約書締結までに双方協議のうえ確定するものといたします。</w:t>
       </w:r>
     </w:p>
     <w:p>

</xml_diff>